<commit_message>
Algorítmica 2.º Esencial v1.1: formato oficio en todo el paquete
Oficio 21,6 × 33 cm (Plan Anual en horizontal), márgenes estrechos de 1,27 cm y tablas
al 100 % del ancho útil, por costo de impresión. Portadas regeneradas en proporción oficio.
Libro 127 págs., solucionario 19, Plan Anual 8, Planes de Clase 65, muestra 17.
Auditoría automática: 860 controles (16 nuevos de formato), 0 fallos.

Co-Authored-By: Claude Opus 5.5 <noreply@anthropic.com>
Claude-Session: https://claude.ai/code/session_01LqBrALZn8HbnzzUtvCFRMa
</commit_message>
<xml_diff>
--- a/algoritmica_2_esencial/salida/Algoritmica_2do_Curso_PLAN_ANUAL_ESENCIAL_COMERCIAL_2026.docx
+++ b/algoritmica_2_esencial/salida/Algoritmica_2do_Curso_PLAN_ANUAL_ESENCIAL_COMERCIAL_2026.docx
@@ -16,7 +16,7 @@
             <wp:positionV relativeFrom="page">
               <wp:posOffset>0</wp:posOffset>
             </wp:positionV>
-            <wp:extent cx="7560000" cy="10692000"/>
+            <wp:extent cx="7776000" cy="11880000"/>
             <wp:effectExtent l="0" t="0" r="0" b="0"/>
             <wp:wrapNone/>
             <wp:docPr id="1" name="Portada" descr="Portada"/>
@@ -37,7 +37,7 @@
                   <pic:spPr>
                     <a:xfrm>
                       <a:off x="0" y="0"/>
-                      <a:ext cx="7560000" cy="10692000"/>
+                      <a:ext cx="7776000" cy="11880000"/>
                     </a:xfrm>
                     <a:prstGeom prst="rect"/>
                   </pic:spPr>
@@ -52,8 +52,8 @@
       <w:pPr>
         <w:sectPr>
           <w:footerReference w:type="default" r:id="rId36"/>
-          <w:pgSz w:w="11906" w:h="16838"/>
-          <w:pgMar w:top="1134" w:right="1247" w:bottom="1134" w:left="1247" w:header="720" w:footer="720" w:gutter="0"/>
+          <w:pgSz w:w="12246" w:h="18709"/>
+          <w:pgMar w:top="720" w:right="720" w:bottom="720" w:left="720" w:header="340" w:footer="340" w:gutter="0"/>
           <w:cols w:space="720"/>
           <w:docGrid w:linePitch="360"/>
         </w:sectPr>
@@ -172,16 +172,16 @@
           <w:right w:w="70" w:type="dxa"/>
         </w:tblCellMar>
         <w:tblLayout w:type="fixed"/>
-        <w:tblW w:w="15082" w:type="dxa"/>
+        <w:tblW w:w="5000" w:type="pct"/>
       </w:tblPr>
       <w:tblGrid>
-        <w:gridCol w:w="567"/>
-        <w:gridCol w:w="2835"/>
-        <w:gridCol w:w="3855"/>
-        <w:gridCol w:w="850"/>
-        <w:gridCol w:w="3005"/>
-        <w:gridCol w:w="2381"/>
-        <w:gridCol w:w="1587"/>
+        <w:gridCol w:w="649"/>
+        <w:gridCol w:w="3246"/>
+        <w:gridCol w:w="4415"/>
+        <w:gridCol w:w="973"/>
+        <w:gridCol w:w="3441"/>
+        <w:gridCol w:w="2726"/>
+        <w:gridCol w:w="1817"/>
       </w:tblGrid>
       <w:tr>
         <w:trPr>
@@ -190,7 +190,7 @@
         </w:trPr>
         <w:tc>
           <w:tcPr>
-            <w:tcW w:type="dxa" w:w="567"/>
+            <w:tcW w:type="dxa" w:w="649"/>
             <w:shd w:val="clear" w:color="auto" w:fill="1B5E20"/>
           </w:tcPr>
           <w:p>
@@ -209,7 +209,7 @@
         </w:tc>
         <w:tc>
           <w:tcPr>
-            <w:tcW w:type="dxa" w:w="2835"/>
+            <w:tcW w:type="dxa" w:w="3246"/>
             <w:shd w:val="clear" w:color="auto" w:fill="1B5E20"/>
           </w:tcPr>
           <w:p>
@@ -228,7 +228,7 @@
         </w:tc>
         <w:tc>
           <w:tcPr>
-            <w:tcW w:type="dxa" w:w="3855"/>
+            <w:tcW w:type="dxa" w:w="4415"/>
             <w:shd w:val="clear" w:color="auto" w:fill="1B5E20"/>
           </w:tcPr>
           <w:p>
@@ -247,7 +247,7 @@
         </w:tc>
         <w:tc>
           <w:tcPr>
-            <w:tcW w:type="dxa" w:w="850"/>
+            <w:tcW w:type="dxa" w:w="974"/>
             <w:shd w:val="clear" w:color="auto" w:fill="1B5E20"/>
           </w:tcPr>
           <w:p>
@@ -266,7 +266,7 @@
         </w:tc>
         <w:tc>
           <w:tcPr>
-            <w:tcW w:type="dxa" w:w="3005"/>
+            <w:tcW w:type="dxa" w:w="3441"/>
             <w:shd w:val="clear" w:color="auto" w:fill="1B5E20"/>
           </w:tcPr>
           <w:p>
@@ -285,7 +285,7 @@
         </w:tc>
         <w:tc>
           <w:tcPr>
-            <w:tcW w:type="dxa" w:w="2381"/>
+            <w:tcW w:type="dxa" w:w="2727"/>
             <w:shd w:val="clear" w:color="auto" w:fill="1B5E20"/>
           </w:tcPr>
           <w:p>
@@ -304,7 +304,7 @@
         </w:tc>
         <w:tc>
           <w:tcPr>
-            <w:tcW w:type="dxa" w:w="1587"/>
+            <w:tcW w:type="dxa" w:w="1818"/>
             <w:shd w:val="clear" w:color="auto" w:fill="1B5E20"/>
           </w:tcPr>
           <w:p>
@@ -328,7 +328,7 @@
         </w:trPr>
         <w:tc>
           <w:tcPr>
-            <w:tcW w:type="dxa" w:w="15080"/>
+            <w:tcW w:type="dxa" w:w="17270"/>
             <w:gridSpan w:val="7"/>
             <w:shd w:val="clear" w:color="auto" w:fill="1B4F72"/>
           </w:tcPr>
@@ -353,7 +353,7 @@
         </w:trPr>
         <w:tc>
           <w:tcPr>
-            <w:tcW w:type="dxa" w:w="15080"/>
+            <w:tcW w:type="dxa" w:w="17270"/>
             <w:gridSpan w:val="7"/>
             <w:shd w:val="clear" w:color="auto" w:fill="2E7D32"/>
           </w:tcPr>
@@ -378,7 +378,7 @@
         </w:trPr>
         <w:tc>
           <w:tcPr>
-            <w:tcW w:type="dxa" w:w="567"/>
+            <w:tcW w:type="dxa" w:w="649"/>
             <w:shd w:val="clear" w:color="auto" w:fill="E8F5E9"/>
           </w:tcPr>
           <w:p>
@@ -396,7 +396,7 @@
         </w:tc>
         <w:tc>
           <w:tcPr>
-            <w:tcW w:type="dxa" w:w="2835"/>
+            <w:tcW w:type="dxa" w:w="3246"/>
           </w:tcPr>
           <w:p>
             <w:pPr>
@@ -413,7 +413,7 @@
         </w:tc>
         <w:tc>
           <w:tcPr>
-            <w:tcW w:type="dxa" w:w="3855"/>
+            <w:tcW w:type="dxa" w:w="4415"/>
           </w:tcPr>
           <w:p>
             <w:pPr>
@@ -454,7 +454,7 @@
         </w:tc>
         <w:tc>
           <w:tcPr>
-            <w:tcW w:type="dxa" w:w="850"/>
+            <w:tcW w:type="dxa" w:w="974"/>
           </w:tcPr>
           <w:p>
             <w:pPr>
@@ -471,7 +471,7 @@
         </w:tc>
         <w:tc>
           <w:tcPr>
-            <w:tcW w:type="dxa" w:w="3005"/>
+            <w:tcW w:type="dxa" w:w="3441"/>
           </w:tcPr>
           <w:p>
             <w:pPr>
@@ -488,7 +488,7 @@
         </w:tc>
         <w:tc>
           <w:tcPr>
-            <w:tcW w:type="dxa" w:w="2381"/>
+            <w:tcW w:type="dxa" w:w="2727"/>
           </w:tcPr>
           <w:p>
             <w:pPr>
@@ -505,7 +505,7 @@
         </w:tc>
         <w:tc>
           <w:tcPr>
-            <w:tcW w:type="dxa" w:w="1587"/>
+            <w:tcW w:type="dxa" w:w="1818"/>
           </w:tcPr>
           <w:p>
             <w:pPr>
@@ -527,7 +527,7 @@
         </w:trPr>
         <w:tc>
           <w:tcPr>
-            <w:tcW w:type="dxa" w:w="567"/>
+            <w:tcW w:type="dxa" w:w="649"/>
             <w:shd w:val="clear" w:color="auto" w:fill="E8F5E9"/>
           </w:tcPr>
           <w:p>
@@ -545,7 +545,7 @@
         </w:tc>
         <w:tc>
           <w:tcPr>
-            <w:tcW w:type="dxa" w:w="2835"/>
+            <w:tcW w:type="dxa" w:w="3246"/>
           </w:tcPr>
           <w:p>
             <w:pPr>
@@ -562,7 +562,7 @@
         </w:tc>
         <w:tc>
           <w:tcPr>
-            <w:tcW w:type="dxa" w:w="3855"/>
+            <w:tcW w:type="dxa" w:w="4415"/>
           </w:tcPr>
           <w:p>
             <w:pPr>
@@ -603,7 +603,7 @@
         </w:tc>
         <w:tc>
           <w:tcPr>
-            <w:tcW w:type="dxa" w:w="850"/>
+            <w:tcW w:type="dxa" w:w="974"/>
           </w:tcPr>
           <w:p>
             <w:pPr>
@@ -620,7 +620,7 @@
         </w:tc>
         <w:tc>
           <w:tcPr>
-            <w:tcW w:type="dxa" w:w="3005"/>
+            <w:tcW w:type="dxa" w:w="3441"/>
           </w:tcPr>
           <w:p>
             <w:pPr>
@@ -637,7 +637,7 @@
         </w:tc>
         <w:tc>
           <w:tcPr>
-            <w:tcW w:type="dxa" w:w="2381"/>
+            <w:tcW w:type="dxa" w:w="2727"/>
           </w:tcPr>
           <w:p>
             <w:pPr>
@@ -654,7 +654,7 @@
         </w:tc>
         <w:tc>
           <w:tcPr>
-            <w:tcW w:type="dxa" w:w="1587"/>
+            <w:tcW w:type="dxa" w:w="1818"/>
           </w:tcPr>
           <w:p>
             <w:pPr>
@@ -676,7 +676,7 @@
         </w:trPr>
         <w:tc>
           <w:tcPr>
-            <w:tcW w:type="dxa" w:w="567"/>
+            <w:tcW w:type="dxa" w:w="649"/>
             <w:shd w:val="clear" w:color="auto" w:fill="E8F5E9"/>
           </w:tcPr>
           <w:p>
@@ -694,7 +694,7 @@
         </w:tc>
         <w:tc>
           <w:tcPr>
-            <w:tcW w:type="dxa" w:w="2835"/>
+            <w:tcW w:type="dxa" w:w="3246"/>
           </w:tcPr>
           <w:p>
             <w:pPr>
@@ -711,7 +711,7 @@
         </w:tc>
         <w:tc>
           <w:tcPr>
-            <w:tcW w:type="dxa" w:w="3855"/>
+            <w:tcW w:type="dxa" w:w="4415"/>
           </w:tcPr>
           <w:p>
             <w:pPr>
@@ -752,7 +752,7 @@
         </w:tc>
         <w:tc>
           <w:tcPr>
-            <w:tcW w:type="dxa" w:w="850"/>
+            <w:tcW w:type="dxa" w:w="974"/>
           </w:tcPr>
           <w:p>
             <w:pPr>
@@ -769,7 +769,7 @@
         </w:tc>
         <w:tc>
           <w:tcPr>
-            <w:tcW w:type="dxa" w:w="3005"/>
+            <w:tcW w:type="dxa" w:w="3441"/>
           </w:tcPr>
           <w:p>
             <w:pPr>
@@ -786,7 +786,7 @@
         </w:tc>
         <w:tc>
           <w:tcPr>
-            <w:tcW w:type="dxa" w:w="2381"/>
+            <w:tcW w:type="dxa" w:w="2727"/>
           </w:tcPr>
           <w:p>
             <w:pPr>
@@ -803,7 +803,7 @@
         </w:tc>
         <w:tc>
           <w:tcPr>
-            <w:tcW w:type="dxa" w:w="1587"/>
+            <w:tcW w:type="dxa" w:w="1818"/>
           </w:tcPr>
           <w:p>
             <w:pPr>
@@ -825,7 +825,7 @@
         </w:trPr>
         <w:tc>
           <w:tcPr>
-            <w:tcW w:type="dxa" w:w="567"/>
+            <w:tcW w:type="dxa" w:w="649"/>
             <w:shd w:val="clear" w:color="auto" w:fill="E8F5E9"/>
           </w:tcPr>
           <w:p>
@@ -843,7 +843,7 @@
         </w:tc>
         <w:tc>
           <w:tcPr>
-            <w:tcW w:type="dxa" w:w="2835"/>
+            <w:tcW w:type="dxa" w:w="3246"/>
           </w:tcPr>
           <w:p>
             <w:pPr>
@@ -860,7 +860,7 @@
         </w:tc>
         <w:tc>
           <w:tcPr>
-            <w:tcW w:type="dxa" w:w="3855"/>
+            <w:tcW w:type="dxa" w:w="4415"/>
           </w:tcPr>
           <w:p>
             <w:pPr>
@@ -901,7 +901,7 @@
         </w:tc>
         <w:tc>
           <w:tcPr>
-            <w:tcW w:type="dxa" w:w="850"/>
+            <w:tcW w:type="dxa" w:w="974"/>
           </w:tcPr>
           <w:p>
             <w:pPr>
@@ -918,7 +918,7 @@
         </w:tc>
         <w:tc>
           <w:tcPr>
-            <w:tcW w:type="dxa" w:w="3005"/>
+            <w:tcW w:type="dxa" w:w="3441"/>
           </w:tcPr>
           <w:p>
             <w:pPr>
@@ -935,7 +935,7 @@
         </w:tc>
         <w:tc>
           <w:tcPr>
-            <w:tcW w:type="dxa" w:w="2381"/>
+            <w:tcW w:type="dxa" w:w="2727"/>
           </w:tcPr>
           <w:p>
             <w:pPr>
@@ -952,7 +952,7 @@
         </w:tc>
         <w:tc>
           <w:tcPr>
-            <w:tcW w:type="dxa" w:w="1587"/>
+            <w:tcW w:type="dxa" w:w="1818"/>
           </w:tcPr>
           <w:p>
             <w:pPr>
@@ -974,7 +974,7 @@
         </w:trPr>
         <w:tc>
           <w:tcPr>
-            <w:tcW w:type="dxa" w:w="567"/>
+            <w:tcW w:type="dxa" w:w="649"/>
             <w:shd w:val="clear" w:color="auto" w:fill="E8F5E9"/>
           </w:tcPr>
           <w:p>
@@ -992,7 +992,7 @@
         </w:tc>
         <w:tc>
           <w:tcPr>
-            <w:tcW w:type="dxa" w:w="2835"/>
+            <w:tcW w:type="dxa" w:w="3246"/>
           </w:tcPr>
           <w:p>
             <w:pPr>
@@ -1009,7 +1009,7 @@
         </w:tc>
         <w:tc>
           <w:tcPr>
-            <w:tcW w:type="dxa" w:w="3855"/>
+            <w:tcW w:type="dxa" w:w="4415"/>
           </w:tcPr>
           <w:p>
             <w:pPr>
@@ -1050,7 +1050,7 @@
         </w:tc>
         <w:tc>
           <w:tcPr>
-            <w:tcW w:type="dxa" w:w="850"/>
+            <w:tcW w:type="dxa" w:w="974"/>
           </w:tcPr>
           <w:p>
             <w:pPr>
@@ -1067,7 +1067,7 @@
         </w:tc>
         <w:tc>
           <w:tcPr>
-            <w:tcW w:type="dxa" w:w="3005"/>
+            <w:tcW w:type="dxa" w:w="3441"/>
           </w:tcPr>
           <w:p>
             <w:pPr>
@@ -1084,7 +1084,7 @@
         </w:tc>
         <w:tc>
           <w:tcPr>
-            <w:tcW w:type="dxa" w:w="2381"/>
+            <w:tcW w:type="dxa" w:w="2727"/>
           </w:tcPr>
           <w:p>
             <w:pPr>
@@ -1101,7 +1101,7 @@
         </w:tc>
         <w:tc>
           <w:tcPr>
-            <w:tcW w:type="dxa" w:w="1587"/>
+            <w:tcW w:type="dxa" w:w="1818"/>
           </w:tcPr>
           <w:p>
             <w:pPr>
@@ -1123,7 +1123,7 @@
         </w:trPr>
         <w:tc>
           <w:tcPr>
-            <w:tcW w:type="dxa" w:w="567"/>
+            <w:tcW w:type="dxa" w:w="649"/>
             <w:shd w:val="clear" w:color="auto" w:fill="E8F5E9"/>
           </w:tcPr>
           <w:p>
@@ -1141,7 +1141,7 @@
         </w:tc>
         <w:tc>
           <w:tcPr>
-            <w:tcW w:type="dxa" w:w="2835"/>
+            <w:tcW w:type="dxa" w:w="3246"/>
           </w:tcPr>
           <w:p>
             <w:pPr>
@@ -1158,7 +1158,7 @@
         </w:tc>
         <w:tc>
           <w:tcPr>
-            <w:tcW w:type="dxa" w:w="3855"/>
+            <w:tcW w:type="dxa" w:w="4415"/>
           </w:tcPr>
           <w:p>
             <w:pPr>
@@ -1199,7 +1199,7 @@
         </w:tc>
         <w:tc>
           <w:tcPr>
-            <w:tcW w:type="dxa" w:w="850"/>
+            <w:tcW w:type="dxa" w:w="974"/>
           </w:tcPr>
           <w:p>
             <w:pPr>
@@ -1216,7 +1216,7 @@
         </w:tc>
         <w:tc>
           <w:tcPr>
-            <w:tcW w:type="dxa" w:w="3005"/>
+            <w:tcW w:type="dxa" w:w="3441"/>
           </w:tcPr>
           <w:p>
             <w:pPr>
@@ -1233,7 +1233,7 @@
         </w:tc>
         <w:tc>
           <w:tcPr>
-            <w:tcW w:type="dxa" w:w="2381"/>
+            <w:tcW w:type="dxa" w:w="2727"/>
           </w:tcPr>
           <w:p>
             <w:pPr>
@@ -1250,7 +1250,7 @@
         </w:tc>
         <w:tc>
           <w:tcPr>
-            <w:tcW w:type="dxa" w:w="1587"/>
+            <w:tcW w:type="dxa" w:w="1818"/>
           </w:tcPr>
           <w:p>
             <w:pPr>
@@ -1272,7 +1272,7 @@
         </w:trPr>
         <w:tc>
           <w:tcPr>
-            <w:tcW w:type="dxa" w:w="567"/>
+            <w:tcW w:type="dxa" w:w="649"/>
             <w:shd w:val="clear" w:color="auto" w:fill="E8F5E9"/>
           </w:tcPr>
           <w:p>
@@ -1290,7 +1290,7 @@
         </w:tc>
         <w:tc>
           <w:tcPr>
-            <w:tcW w:type="dxa" w:w="2835"/>
+            <w:tcW w:type="dxa" w:w="3246"/>
           </w:tcPr>
           <w:p>
             <w:pPr>
@@ -1307,7 +1307,7 @@
         </w:tc>
         <w:tc>
           <w:tcPr>
-            <w:tcW w:type="dxa" w:w="3855"/>
+            <w:tcW w:type="dxa" w:w="4415"/>
           </w:tcPr>
           <w:p>
             <w:pPr>
@@ -1348,7 +1348,7 @@
         </w:tc>
         <w:tc>
           <w:tcPr>
-            <w:tcW w:type="dxa" w:w="850"/>
+            <w:tcW w:type="dxa" w:w="974"/>
           </w:tcPr>
           <w:p>
             <w:pPr>
@@ -1365,7 +1365,7 @@
         </w:tc>
         <w:tc>
           <w:tcPr>
-            <w:tcW w:type="dxa" w:w="3005"/>
+            <w:tcW w:type="dxa" w:w="3441"/>
           </w:tcPr>
           <w:p>
             <w:pPr>
@@ -1382,7 +1382,7 @@
         </w:tc>
         <w:tc>
           <w:tcPr>
-            <w:tcW w:type="dxa" w:w="2381"/>
+            <w:tcW w:type="dxa" w:w="2727"/>
           </w:tcPr>
           <w:p>
             <w:pPr>
@@ -1399,7 +1399,7 @@
         </w:tc>
         <w:tc>
           <w:tcPr>
-            <w:tcW w:type="dxa" w:w="1587"/>
+            <w:tcW w:type="dxa" w:w="1818"/>
           </w:tcPr>
           <w:p>
             <w:pPr>
@@ -1421,7 +1421,7 @@
         </w:trPr>
         <w:tc>
           <w:tcPr>
-            <w:tcW w:type="dxa" w:w="567"/>
+            <w:tcW w:type="dxa" w:w="649"/>
             <w:shd w:val="clear" w:color="auto" w:fill="E8F5E9"/>
           </w:tcPr>
           <w:p>
@@ -1439,7 +1439,7 @@
         </w:tc>
         <w:tc>
           <w:tcPr>
-            <w:tcW w:type="dxa" w:w="2835"/>
+            <w:tcW w:type="dxa" w:w="3246"/>
           </w:tcPr>
           <w:p>
             <w:pPr>
@@ -1468,7 +1468,7 @@
         </w:tc>
         <w:tc>
           <w:tcPr>
-            <w:tcW w:type="dxa" w:w="3855"/>
+            <w:tcW w:type="dxa" w:w="4415"/>
           </w:tcPr>
           <w:p>
             <w:pPr>
@@ -1509,7 +1509,7 @@
         </w:tc>
         <w:tc>
           <w:tcPr>
-            <w:tcW w:type="dxa" w:w="850"/>
+            <w:tcW w:type="dxa" w:w="974"/>
           </w:tcPr>
           <w:p>
             <w:pPr>
@@ -1526,7 +1526,7 @@
         </w:tc>
         <w:tc>
           <w:tcPr>
-            <w:tcW w:type="dxa" w:w="3005"/>
+            <w:tcW w:type="dxa" w:w="3441"/>
           </w:tcPr>
           <w:p>
             <w:pPr>
@@ -1543,7 +1543,7 @@
         </w:tc>
         <w:tc>
           <w:tcPr>
-            <w:tcW w:type="dxa" w:w="2381"/>
+            <w:tcW w:type="dxa" w:w="2727"/>
           </w:tcPr>
           <w:p>
             <w:pPr>
@@ -1560,7 +1560,7 @@
         </w:tc>
         <w:tc>
           <w:tcPr>
-            <w:tcW w:type="dxa" w:w="1587"/>
+            <w:tcW w:type="dxa" w:w="1818"/>
           </w:tcPr>
           <w:p>
             <w:pPr>
@@ -1582,7 +1582,7 @@
         </w:trPr>
         <w:tc>
           <w:tcPr>
-            <w:tcW w:type="dxa" w:w="15080"/>
+            <w:tcW w:type="dxa" w:w="17270"/>
             <w:gridSpan w:val="7"/>
             <w:shd w:val="clear" w:color="auto" w:fill="2E7D32"/>
           </w:tcPr>
@@ -1607,7 +1607,7 @@
         </w:trPr>
         <w:tc>
           <w:tcPr>
-            <w:tcW w:type="dxa" w:w="567"/>
+            <w:tcW w:type="dxa" w:w="649"/>
             <w:shd w:val="clear" w:color="auto" w:fill="E8F5E9"/>
           </w:tcPr>
           <w:p>
@@ -1625,7 +1625,7 @@
         </w:tc>
         <w:tc>
           <w:tcPr>
-            <w:tcW w:type="dxa" w:w="2835"/>
+            <w:tcW w:type="dxa" w:w="3246"/>
           </w:tcPr>
           <w:p>
             <w:pPr>
@@ -1642,7 +1642,7 @@
         </w:tc>
         <w:tc>
           <w:tcPr>
-            <w:tcW w:type="dxa" w:w="3855"/>
+            <w:tcW w:type="dxa" w:w="4415"/>
           </w:tcPr>
           <w:p>
             <w:pPr>
@@ -1683,7 +1683,7 @@
         </w:tc>
         <w:tc>
           <w:tcPr>
-            <w:tcW w:type="dxa" w:w="850"/>
+            <w:tcW w:type="dxa" w:w="974"/>
           </w:tcPr>
           <w:p>
             <w:pPr>
@@ -1700,7 +1700,7 @@
         </w:tc>
         <w:tc>
           <w:tcPr>
-            <w:tcW w:type="dxa" w:w="3005"/>
+            <w:tcW w:type="dxa" w:w="3441"/>
           </w:tcPr>
           <w:p>
             <w:pPr>
@@ -1717,7 +1717,7 @@
         </w:tc>
         <w:tc>
           <w:tcPr>
-            <w:tcW w:type="dxa" w:w="2381"/>
+            <w:tcW w:type="dxa" w:w="2727"/>
           </w:tcPr>
           <w:p>
             <w:pPr>
@@ -1734,7 +1734,7 @@
         </w:tc>
         <w:tc>
           <w:tcPr>
-            <w:tcW w:type="dxa" w:w="1587"/>
+            <w:tcW w:type="dxa" w:w="1818"/>
           </w:tcPr>
           <w:p>
             <w:pPr>
@@ -1756,7 +1756,7 @@
         </w:trPr>
         <w:tc>
           <w:tcPr>
-            <w:tcW w:type="dxa" w:w="567"/>
+            <w:tcW w:type="dxa" w:w="649"/>
             <w:shd w:val="clear" w:color="auto" w:fill="E8F5E9"/>
           </w:tcPr>
           <w:p>
@@ -1774,7 +1774,7 @@
         </w:tc>
         <w:tc>
           <w:tcPr>
-            <w:tcW w:type="dxa" w:w="2835"/>
+            <w:tcW w:type="dxa" w:w="3246"/>
           </w:tcPr>
           <w:p>
             <w:pPr>
@@ -1791,7 +1791,7 @@
         </w:tc>
         <w:tc>
           <w:tcPr>
-            <w:tcW w:type="dxa" w:w="3855"/>
+            <w:tcW w:type="dxa" w:w="4415"/>
           </w:tcPr>
           <w:p>
             <w:pPr>
@@ -1832,7 +1832,7 @@
         </w:tc>
         <w:tc>
           <w:tcPr>
-            <w:tcW w:type="dxa" w:w="850"/>
+            <w:tcW w:type="dxa" w:w="974"/>
           </w:tcPr>
           <w:p>
             <w:pPr>
@@ -1849,7 +1849,7 @@
         </w:tc>
         <w:tc>
           <w:tcPr>
-            <w:tcW w:type="dxa" w:w="3005"/>
+            <w:tcW w:type="dxa" w:w="3441"/>
           </w:tcPr>
           <w:p>
             <w:pPr>
@@ -1866,7 +1866,7 @@
         </w:tc>
         <w:tc>
           <w:tcPr>
-            <w:tcW w:type="dxa" w:w="2381"/>
+            <w:tcW w:type="dxa" w:w="2727"/>
           </w:tcPr>
           <w:p>
             <w:pPr>
@@ -1883,7 +1883,7 @@
         </w:tc>
         <w:tc>
           <w:tcPr>
-            <w:tcW w:type="dxa" w:w="1587"/>
+            <w:tcW w:type="dxa" w:w="1818"/>
           </w:tcPr>
           <w:p>
             <w:pPr>
@@ -1905,7 +1905,7 @@
         </w:trPr>
         <w:tc>
           <w:tcPr>
-            <w:tcW w:type="dxa" w:w="567"/>
+            <w:tcW w:type="dxa" w:w="649"/>
             <w:shd w:val="clear" w:color="auto" w:fill="E8F5E9"/>
           </w:tcPr>
           <w:p>
@@ -1923,7 +1923,7 @@
         </w:tc>
         <w:tc>
           <w:tcPr>
-            <w:tcW w:type="dxa" w:w="2835"/>
+            <w:tcW w:type="dxa" w:w="3246"/>
           </w:tcPr>
           <w:p>
             <w:pPr>
@@ -1940,7 +1940,7 @@
         </w:tc>
         <w:tc>
           <w:tcPr>
-            <w:tcW w:type="dxa" w:w="3855"/>
+            <w:tcW w:type="dxa" w:w="4415"/>
           </w:tcPr>
           <w:p>
             <w:pPr>
@@ -1981,7 +1981,7 @@
         </w:tc>
         <w:tc>
           <w:tcPr>
-            <w:tcW w:type="dxa" w:w="850"/>
+            <w:tcW w:type="dxa" w:w="974"/>
           </w:tcPr>
           <w:p>
             <w:pPr>
@@ -1998,7 +1998,7 @@
         </w:tc>
         <w:tc>
           <w:tcPr>
-            <w:tcW w:type="dxa" w:w="3005"/>
+            <w:tcW w:type="dxa" w:w="3441"/>
           </w:tcPr>
           <w:p>
             <w:pPr>
@@ -2015,7 +2015,7 @@
         </w:tc>
         <w:tc>
           <w:tcPr>
-            <w:tcW w:type="dxa" w:w="2381"/>
+            <w:tcW w:type="dxa" w:w="2727"/>
           </w:tcPr>
           <w:p>
             <w:pPr>
@@ -2032,7 +2032,7 @@
         </w:tc>
         <w:tc>
           <w:tcPr>
-            <w:tcW w:type="dxa" w:w="1587"/>
+            <w:tcW w:type="dxa" w:w="1818"/>
           </w:tcPr>
           <w:p>
             <w:pPr>
@@ -2054,7 +2054,7 @@
         </w:trPr>
         <w:tc>
           <w:tcPr>
-            <w:tcW w:type="dxa" w:w="567"/>
+            <w:tcW w:type="dxa" w:w="649"/>
             <w:shd w:val="clear" w:color="auto" w:fill="E8F5E9"/>
           </w:tcPr>
           <w:p>
@@ -2072,7 +2072,7 @@
         </w:tc>
         <w:tc>
           <w:tcPr>
-            <w:tcW w:type="dxa" w:w="2835"/>
+            <w:tcW w:type="dxa" w:w="3246"/>
           </w:tcPr>
           <w:p>
             <w:pPr>
@@ -2101,7 +2101,7 @@
         </w:tc>
         <w:tc>
           <w:tcPr>
-            <w:tcW w:type="dxa" w:w="3855"/>
+            <w:tcW w:type="dxa" w:w="4415"/>
           </w:tcPr>
           <w:p>
             <w:pPr>
@@ -2142,7 +2142,7 @@
         </w:tc>
         <w:tc>
           <w:tcPr>
-            <w:tcW w:type="dxa" w:w="850"/>
+            <w:tcW w:type="dxa" w:w="974"/>
           </w:tcPr>
           <w:p>
             <w:pPr>
@@ -2159,7 +2159,7 @@
         </w:tc>
         <w:tc>
           <w:tcPr>
-            <w:tcW w:type="dxa" w:w="3005"/>
+            <w:tcW w:type="dxa" w:w="3441"/>
           </w:tcPr>
           <w:p>
             <w:pPr>
@@ -2176,7 +2176,7 @@
         </w:tc>
         <w:tc>
           <w:tcPr>
-            <w:tcW w:type="dxa" w:w="2381"/>
+            <w:tcW w:type="dxa" w:w="2727"/>
           </w:tcPr>
           <w:p>
             <w:pPr>
@@ -2193,7 +2193,7 @@
         </w:tc>
         <w:tc>
           <w:tcPr>
-            <w:tcW w:type="dxa" w:w="1587"/>
+            <w:tcW w:type="dxa" w:w="1818"/>
           </w:tcPr>
           <w:p>
             <w:pPr>
@@ -2215,7 +2215,7 @@
         </w:trPr>
         <w:tc>
           <w:tcPr>
-            <w:tcW w:type="dxa" w:w="567"/>
+            <w:tcW w:type="dxa" w:w="649"/>
             <w:shd w:val="clear" w:color="auto" w:fill="E8F5E9"/>
           </w:tcPr>
           <w:p>
@@ -2233,7 +2233,7 @@
         </w:tc>
         <w:tc>
           <w:tcPr>
-            <w:tcW w:type="dxa" w:w="2835"/>
+            <w:tcW w:type="dxa" w:w="3246"/>
           </w:tcPr>
           <w:p>
             <w:pPr>
@@ -2250,7 +2250,7 @@
         </w:tc>
         <w:tc>
           <w:tcPr>
-            <w:tcW w:type="dxa" w:w="3855"/>
+            <w:tcW w:type="dxa" w:w="4415"/>
           </w:tcPr>
           <w:p>
             <w:pPr>
@@ -2291,7 +2291,7 @@
         </w:tc>
         <w:tc>
           <w:tcPr>
-            <w:tcW w:type="dxa" w:w="850"/>
+            <w:tcW w:type="dxa" w:w="974"/>
           </w:tcPr>
           <w:p>
             <w:pPr>
@@ -2308,7 +2308,7 @@
         </w:tc>
         <w:tc>
           <w:tcPr>
-            <w:tcW w:type="dxa" w:w="3005"/>
+            <w:tcW w:type="dxa" w:w="3441"/>
           </w:tcPr>
           <w:p>
             <w:pPr>
@@ -2325,7 +2325,7 @@
         </w:tc>
         <w:tc>
           <w:tcPr>
-            <w:tcW w:type="dxa" w:w="2381"/>
+            <w:tcW w:type="dxa" w:w="2727"/>
           </w:tcPr>
           <w:p>
             <w:pPr>
@@ -2342,7 +2342,7 @@
         </w:tc>
         <w:tc>
           <w:tcPr>
-            <w:tcW w:type="dxa" w:w="1587"/>
+            <w:tcW w:type="dxa" w:w="1818"/>
           </w:tcPr>
           <w:p>
             <w:pPr>
@@ -2364,7 +2364,7 @@
         </w:trPr>
         <w:tc>
           <w:tcPr>
-            <w:tcW w:type="dxa" w:w="567"/>
+            <w:tcW w:type="dxa" w:w="649"/>
             <w:shd w:val="clear" w:color="auto" w:fill="E8F5E9"/>
           </w:tcPr>
           <w:p>
@@ -2382,7 +2382,7 @@
         </w:tc>
         <w:tc>
           <w:tcPr>
-            <w:tcW w:type="dxa" w:w="2835"/>
+            <w:tcW w:type="dxa" w:w="3246"/>
           </w:tcPr>
           <w:p>
             <w:pPr>
@@ -2399,7 +2399,7 @@
         </w:tc>
         <w:tc>
           <w:tcPr>
-            <w:tcW w:type="dxa" w:w="3855"/>
+            <w:tcW w:type="dxa" w:w="4415"/>
           </w:tcPr>
           <w:p>
             <w:pPr>
@@ -2440,7 +2440,7 @@
         </w:tc>
         <w:tc>
           <w:tcPr>
-            <w:tcW w:type="dxa" w:w="850"/>
+            <w:tcW w:type="dxa" w:w="974"/>
           </w:tcPr>
           <w:p>
             <w:pPr>
@@ -2457,7 +2457,7 @@
         </w:tc>
         <w:tc>
           <w:tcPr>
-            <w:tcW w:type="dxa" w:w="3005"/>
+            <w:tcW w:type="dxa" w:w="3441"/>
           </w:tcPr>
           <w:p>
             <w:pPr>
@@ -2474,7 +2474,7 @@
         </w:tc>
         <w:tc>
           <w:tcPr>
-            <w:tcW w:type="dxa" w:w="2381"/>
+            <w:tcW w:type="dxa" w:w="2727"/>
           </w:tcPr>
           <w:p>
             <w:pPr>
@@ -2491,7 +2491,7 @@
         </w:tc>
         <w:tc>
           <w:tcPr>
-            <w:tcW w:type="dxa" w:w="1587"/>
+            <w:tcW w:type="dxa" w:w="1818"/>
           </w:tcPr>
           <w:p>
             <w:pPr>
@@ -2513,7 +2513,7 @@
         </w:trPr>
         <w:tc>
           <w:tcPr>
-            <w:tcW w:type="dxa" w:w="567"/>
+            <w:tcW w:type="dxa" w:w="649"/>
             <w:shd w:val="clear" w:color="auto" w:fill="E8F5E9"/>
           </w:tcPr>
           <w:p>
@@ -2531,7 +2531,7 @@
         </w:tc>
         <w:tc>
           <w:tcPr>
-            <w:tcW w:type="dxa" w:w="2835"/>
+            <w:tcW w:type="dxa" w:w="3246"/>
           </w:tcPr>
           <w:p>
             <w:pPr>
@@ -2548,7 +2548,7 @@
         </w:tc>
         <w:tc>
           <w:tcPr>
-            <w:tcW w:type="dxa" w:w="3855"/>
+            <w:tcW w:type="dxa" w:w="4415"/>
           </w:tcPr>
           <w:p>
             <w:pPr>
@@ -2589,7 +2589,7 @@
         </w:tc>
         <w:tc>
           <w:tcPr>
-            <w:tcW w:type="dxa" w:w="850"/>
+            <w:tcW w:type="dxa" w:w="974"/>
           </w:tcPr>
           <w:p>
             <w:pPr>
@@ -2606,7 +2606,7 @@
         </w:tc>
         <w:tc>
           <w:tcPr>
-            <w:tcW w:type="dxa" w:w="3005"/>
+            <w:tcW w:type="dxa" w:w="3441"/>
           </w:tcPr>
           <w:p>
             <w:pPr>
@@ -2623,7 +2623,7 @@
         </w:tc>
         <w:tc>
           <w:tcPr>
-            <w:tcW w:type="dxa" w:w="2381"/>
+            <w:tcW w:type="dxa" w:w="2727"/>
           </w:tcPr>
           <w:p>
             <w:pPr>
@@ -2640,7 +2640,7 @@
         </w:tc>
         <w:tc>
           <w:tcPr>
-            <w:tcW w:type="dxa" w:w="1587"/>
+            <w:tcW w:type="dxa" w:w="1818"/>
           </w:tcPr>
           <w:p>
             <w:pPr>
@@ -2662,7 +2662,7 @@
         </w:trPr>
         <w:tc>
           <w:tcPr>
-            <w:tcW w:type="dxa" w:w="567"/>
+            <w:tcW w:type="dxa" w:w="649"/>
             <w:shd w:val="clear" w:color="auto" w:fill="E8F5E9"/>
           </w:tcPr>
           <w:p>
@@ -2680,7 +2680,7 @@
         </w:tc>
         <w:tc>
           <w:tcPr>
-            <w:tcW w:type="dxa" w:w="2835"/>
+            <w:tcW w:type="dxa" w:w="3246"/>
           </w:tcPr>
           <w:p>
             <w:pPr>
@@ -2697,7 +2697,7 @@
         </w:tc>
         <w:tc>
           <w:tcPr>
-            <w:tcW w:type="dxa" w:w="3855"/>
+            <w:tcW w:type="dxa" w:w="4415"/>
           </w:tcPr>
           <w:p>
             <w:pPr>
@@ -2738,7 +2738,7 @@
         </w:tc>
         <w:tc>
           <w:tcPr>
-            <w:tcW w:type="dxa" w:w="850"/>
+            <w:tcW w:type="dxa" w:w="974"/>
           </w:tcPr>
           <w:p>
             <w:pPr>
@@ -2755,7 +2755,7 @@
         </w:tc>
         <w:tc>
           <w:tcPr>
-            <w:tcW w:type="dxa" w:w="3005"/>
+            <w:tcW w:type="dxa" w:w="3441"/>
           </w:tcPr>
           <w:p>
             <w:pPr>
@@ -2772,7 +2772,7 @@
         </w:tc>
         <w:tc>
           <w:tcPr>
-            <w:tcW w:type="dxa" w:w="2381"/>
+            <w:tcW w:type="dxa" w:w="2727"/>
           </w:tcPr>
           <w:p>
             <w:pPr>
@@ -2789,7 +2789,7 @@
         </w:tc>
         <w:tc>
           <w:tcPr>
-            <w:tcW w:type="dxa" w:w="1587"/>
+            <w:tcW w:type="dxa" w:w="1818"/>
           </w:tcPr>
           <w:p>
             <w:pPr>
@@ -2811,7 +2811,7 @@
         </w:trPr>
         <w:tc>
           <w:tcPr>
-            <w:tcW w:type="dxa" w:w="567"/>
+            <w:tcW w:type="dxa" w:w="649"/>
             <w:shd w:val="clear" w:color="auto" w:fill="E8F5E9"/>
           </w:tcPr>
           <w:p>
@@ -2829,7 +2829,7 @@
         </w:tc>
         <w:tc>
           <w:tcPr>
-            <w:tcW w:type="dxa" w:w="2835"/>
+            <w:tcW w:type="dxa" w:w="3246"/>
           </w:tcPr>
           <w:p>
             <w:pPr>
@@ -2858,7 +2858,7 @@
         </w:tc>
         <w:tc>
           <w:tcPr>
-            <w:tcW w:type="dxa" w:w="3855"/>
+            <w:tcW w:type="dxa" w:w="4415"/>
           </w:tcPr>
           <w:p>
             <w:pPr>
@@ -2899,7 +2899,7 @@
         </w:tc>
         <w:tc>
           <w:tcPr>
-            <w:tcW w:type="dxa" w:w="850"/>
+            <w:tcW w:type="dxa" w:w="974"/>
           </w:tcPr>
           <w:p>
             <w:pPr>
@@ -2916,7 +2916,7 @@
         </w:tc>
         <w:tc>
           <w:tcPr>
-            <w:tcW w:type="dxa" w:w="3005"/>
+            <w:tcW w:type="dxa" w:w="3441"/>
           </w:tcPr>
           <w:p>
             <w:pPr>
@@ -2933,7 +2933,7 @@
         </w:tc>
         <w:tc>
           <w:tcPr>
-            <w:tcW w:type="dxa" w:w="2381"/>
+            <w:tcW w:type="dxa" w:w="2727"/>
           </w:tcPr>
           <w:p>
             <w:pPr>
@@ -2950,7 +2950,7 @@
         </w:tc>
         <w:tc>
           <w:tcPr>
-            <w:tcW w:type="dxa" w:w="1587"/>
+            <w:tcW w:type="dxa" w:w="1818"/>
           </w:tcPr>
           <w:p>
             <w:pPr>
@@ -2972,7 +2972,7 @@
         </w:trPr>
         <w:tc>
           <w:tcPr>
-            <w:tcW w:type="dxa" w:w="567"/>
+            <w:tcW w:type="dxa" w:w="649"/>
             <w:shd w:val="clear" w:color="auto" w:fill="EAF0F6"/>
           </w:tcPr>
           <w:p>
@@ -2990,7 +2990,7 @@
         </w:tc>
         <w:tc>
           <w:tcPr>
-            <w:tcW w:type="dxa" w:w="2835"/>
+            <w:tcW w:type="dxa" w:w="3246"/>
             <w:shd w:val="clear" w:color="auto" w:fill="EAF0F6"/>
           </w:tcPr>
           <w:p>
@@ -3008,7 +3008,7 @@
         </w:tc>
         <w:tc>
           <w:tcPr>
-            <w:tcW w:type="dxa" w:w="3855"/>
+            <w:tcW w:type="dxa" w:w="4415"/>
             <w:shd w:val="clear" w:color="auto" w:fill="EAF0F6"/>
           </w:tcPr>
           <w:p>
@@ -3050,7 +3050,7 @@
         </w:tc>
         <w:tc>
           <w:tcPr>
-            <w:tcW w:type="dxa" w:w="850"/>
+            <w:tcW w:type="dxa" w:w="974"/>
             <w:shd w:val="clear" w:color="auto" w:fill="EAF0F6"/>
           </w:tcPr>
           <w:p>
@@ -3068,7 +3068,7 @@
         </w:tc>
         <w:tc>
           <w:tcPr>
-            <w:tcW w:type="dxa" w:w="3005"/>
+            <w:tcW w:type="dxa" w:w="3441"/>
             <w:shd w:val="clear" w:color="auto" w:fill="EAF0F6"/>
           </w:tcPr>
           <w:p>
@@ -3086,7 +3086,7 @@
         </w:tc>
         <w:tc>
           <w:tcPr>
-            <w:tcW w:type="dxa" w:w="2381"/>
+            <w:tcW w:type="dxa" w:w="2727"/>
             <w:shd w:val="clear" w:color="auto" w:fill="EAF0F6"/>
           </w:tcPr>
           <w:p>
@@ -3104,7 +3104,7 @@
         </w:tc>
         <w:tc>
           <w:tcPr>
-            <w:tcW w:type="dxa" w:w="1587"/>
+            <w:tcW w:type="dxa" w:w="1818"/>
             <w:shd w:val="clear" w:color="auto" w:fill="EAF0F6"/>
           </w:tcPr>
           <w:p>
@@ -3127,7 +3127,7 @@
         </w:trPr>
         <w:tc>
           <w:tcPr>
-            <w:tcW w:type="dxa" w:w="15080"/>
+            <w:tcW w:type="dxa" w:w="17270"/>
             <w:gridSpan w:val="7"/>
             <w:shd w:val="clear" w:color="auto" w:fill="1B4F72"/>
           </w:tcPr>
@@ -3152,7 +3152,7 @@
         </w:trPr>
         <w:tc>
           <w:tcPr>
-            <w:tcW w:type="dxa" w:w="15080"/>
+            <w:tcW w:type="dxa" w:w="17270"/>
             <w:gridSpan w:val="7"/>
             <w:shd w:val="clear" w:color="auto" w:fill="2E7D32"/>
           </w:tcPr>
@@ -3177,7 +3177,7 @@
         </w:trPr>
         <w:tc>
           <w:tcPr>
-            <w:tcW w:type="dxa" w:w="567"/>
+            <w:tcW w:type="dxa" w:w="649"/>
             <w:shd w:val="clear" w:color="auto" w:fill="E8F5E9"/>
           </w:tcPr>
           <w:p>
@@ -3195,7 +3195,7 @@
         </w:tc>
         <w:tc>
           <w:tcPr>
-            <w:tcW w:type="dxa" w:w="2835"/>
+            <w:tcW w:type="dxa" w:w="3246"/>
           </w:tcPr>
           <w:p>
             <w:pPr>
@@ -3212,7 +3212,7 @@
         </w:tc>
         <w:tc>
           <w:tcPr>
-            <w:tcW w:type="dxa" w:w="3855"/>
+            <w:tcW w:type="dxa" w:w="4415"/>
           </w:tcPr>
           <w:p>
             <w:pPr>
@@ -3253,7 +3253,7 @@
         </w:tc>
         <w:tc>
           <w:tcPr>
-            <w:tcW w:type="dxa" w:w="850"/>
+            <w:tcW w:type="dxa" w:w="974"/>
           </w:tcPr>
           <w:p>
             <w:pPr>
@@ -3270,7 +3270,7 @@
         </w:tc>
         <w:tc>
           <w:tcPr>
-            <w:tcW w:type="dxa" w:w="3005"/>
+            <w:tcW w:type="dxa" w:w="3441"/>
           </w:tcPr>
           <w:p>
             <w:pPr>
@@ -3287,7 +3287,7 @@
         </w:tc>
         <w:tc>
           <w:tcPr>
-            <w:tcW w:type="dxa" w:w="2381"/>
+            <w:tcW w:type="dxa" w:w="2727"/>
           </w:tcPr>
           <w:p>
             <w:pPr>
@@ -3304,7 +3304,7 @@
         </w:tc>
         <w:tc>
           <w:tcPr>
-            <w:tcW w:type="dxa" w:w="1587"/>
+            <w:tcW w:type="dxa" w:w="1818"/>
           </w:tcPr>
           <w:p>
             <w:pPr>
@@ -3326,7 +3326,7 @@
         </w:trPr>
         <w:tc>
           <w:tcPr>
-            <w:tcW w:type="dxa" w:w="567"/>
+            <w:tcW w:type="dxa" w:w="649"/>
             <w:shd w:val="clear" w:color="auto" w:fill="E8F5E9"/>
           </w:tcPr>
           <w:p>
@@ -3344,7 +3344,7 @@
         </w:tc>
         <w:tc>
           <w:tcPr>
-            <w:tcW w:type="dxa" w:w="2835"/>
+            <w:tcW w:type="dxa" w:w="3246"/>
           </w:tcPr>
           <w:p>
             <w:pPr>
@@ -3373,7 +3373,7 @@
         </w:tc>
         <w:tc>
           <w:tcPr>
-            <w:tcW w:type="dxa" w:w="3855"/>
+            <w:tcW w:type="dxa" w:w="4415"/>
           </w:tcPr>
           <w:p>
             <w:pPr>
@@ -3414,7 +3414,7 @@
         </w:tc>
         <w:tc>
           <w:tcPr>
-            <w:tcW w:type="dxa" w:w="850"/>
+            <w:tcW w:type="dxa" w:w="974"/>
           </w:tcPr>
           <w:p>
             <w:pPr>
@@ -3431,7 +3431,7 @@
         </w:tc>
         <w:tc>
           <w:tcPr>
-            <w:tcW w:type="dxa" w:w="3005"/>
+            <w:tcW w:type="dxa" w:w="3441"/>
           </w:tcPr>
           <w:p>
             <w:pPr>
@@ -3448,7 +3448,7 @@
         </w:tc>
         <w:tc>
           <w:tcPr>
-            <w:tcW w:type="dxa" w:w="2381"/>
+            <w:tcW w:type="dxa" w:w="2727"/>
           </w:tcPr>
           <w:p>
             <w:pPr>
@@ -3465,7 +3465,7 @@
         </w:tc>
         <w:tc>
           <w:tcPr>
-            <w:tcW w:type="dxa" w:w="1587"/>
+            <w:tcW w:type="dxa" w:w="1818"/>
           </w:tcPr>
           <w:p>
             <w:pPr>
@@ -3487,7 +3487,7 @@
         </w:trPr>
         <w:tc>
           <w:tcPr>
-            <w:tcW w:type="dxa" w:w="567"/>
+            <w:tcW w:type="dxa" w:w="649"/>
             <w:shd w:val="clear" w:color="auto" w:fill="E8F5E9"/>
           </w:tcPr>
           <w:p>
@@ -3505,7 +3505,7 @@
         </w:tc>
         <w:tc>
           <w:tcPr>
-            <w:tcW w:type="dxa" w:w="2835"/>
+            <w:tcW w:type="dxa" w:w="3246"/>
           </w:tcPr>
           <w:p>
             <w:pPr>
@@ -3522,7 +3522,7 @@
         </w:tc>
         <w:tc>
           <w:tcPr>
-            <w:tcW w:type="dxa" w:w="3855"/>
+            <w:tcW w:type="dxa" w:w="4415"/>
           </w:tcPr>
           <w:p>
             <w:pPr>
@@ -3563,7 +3563,7 @@
         </w:tc>
         <w:tc>
           <w:tcPr>
-            <w:tcW w:type="dxa" w:w="850"/>
+            <w:tcW w:type="dxa" w:w="974"/>
           </w:tcPr>
           <w:p>
             <w:pPr>
@@ -3580,7 +3580,7 @@
         </w:tc>
         <w:tc>
           <w:tcPr>
-            <w:tcW w:type="dxa" w:w="3005"/>
+            <w:tcW w:type="dxa" w:w="3441"/>
           </w:tcPr>
           <w:p>
             <w:pPr>
@@ -3597,7 +3597,7 @@
         </w:tc>
         <w:tc>
           <w:tcPr>
-            <w:tcW w:type="dxa" w:w="2381"/>
+            <w:tcW w:type="dxa" w:w="2727"/>
           </w:tcPr>
           <w:p>
             <w:pPr>
@@ -3614,7 +3614,7 @@
         </w:tc>
         <w:tc>
           <w:tcPr>
-            <w:tcW w:type="dxa" w:w="1587"/>
+            <w:tcW w:type="dxa" w:w="1818"/>
           </w:tcPr>
           <w:p>
             <w:pPr>
@@ -3636,7 +3636,7 @@
         </w:trPr>
         <w:tc>
           <w:tcPr>
-            <w:tcW w:type="dxa" w:w="567"/>
+            <w:tcW w:type="dxa" w:w="649"/>
             <w:shd w:val="clear" w:color="auto" w:fill="E8F5E9"/>
           </w:tcPr>
           <w:p>
@@ -3654,7 +3654,7 @@
         </w:tc>
         <w:tc>
           <w:tcPr>
-            <w:tcW w:type="dxa" w:w="2835"/>
+            <w:tcW w:type="dxa" w:w="3246"/>
           </w:tcPr>
           <w:p>
             <w:pPr>
@@ -3683,7 +3683,7 @@
         </w:tc>
         <w:tc>
           <w:tcPr>
-            <w:tcW w:type="dxa" w:w="3855"/>
+            <w:tcW w:type="dxa" w:w="4415"/>
           </w:tcPr>
           <w:p>
             <w:pPr>
@@ -3724,7 +3724,7 @@
         </w:tc>
         <w:tc>
           <w:tcPr>
-            <w:tcW w:type="dxa" w:w="850"/>
+            <w:tcW w:type="dxa" w:w="974"/>
           </w:tcPr>
           <w:p>
             <w:pPr>
@@ -3741,7 +3741,7 @@
         </w:tc>
         <w:tc>
           <w:tcPr>
-            <w:tcW w:type="dxa" w:w="3005"/>
+            <w:tcW w:type="dxa" w:w="3441"/>
           </w:tcPr>
           <w:p>
             <w:pPr>
@@ -3758,7 +3758,7 @@
         </w:tc>
         <w:tc>
           <w:tcPr>
-            <w:tcW w:type="dxa" w:w="2381"/>
+            <w:tcW w:type="dxa" w:w="2727"/>
           </w:tcPr>
           <w:p>
             <w:pPr>
@@ -3775,7 +3775,7 @@
         </w:tc>
         <w:tc>
           <w:tcPr>
-            <w:tcW w:type="dxa" w:w="1587"/>
+            <w:tcW w:type="dxa" w:w="1818"/>
           </w:tcPr>
           <w:p>
             <w:pPr>
@@ -3797,7 +3797,7 @@
         </w:trPr>
         <w:tc>
           <w:tcPr>
-            <w:tcW w:type="dxa" w:w="567"/>
+            <w:tcW w:type="dxa" w:w="649"/>
             <w:shd w:val="clear" w:color="auto" w:fill="E8F5E9"/>
           </w:tcPr>
           <w:p>
@@ -3815,7 +3815,7 @@
         </w:tc>
         <w:tc>
           <w:tcPr>
-            <w:tcW w:type="dxa" w:w="2835"/>
+            <w:tcW w:type="dxa" w:w="3246"/>
           </w:tcPr>
           <w:p>
             <w:pPr>
@@ -3832,7 +3832,7 @@
         </w:tc>
         <w:tc>
           <w:tcPr>
-            <w:tcW w:type="dxa" w:w="3855"/>
+            <w:tcW w:type="dxa" w:w="4415"/>
           </w:tcPr>
           <w:p>
             <w:pPr>
@@ -3873,7 +3873,7 @@
         </w:tc>
         <w:tc>
           <w:tcPr>
-            <w:tcW w:type="dxa" w:w="850"/>
+            <w:tcW w:type="dxa" w:w="974"/>
           </w:tcPr>
           <w:p>
             <w:pPr>
@@ -3890,7 +3890,7 @@
         </w:tc>
         <w:tc>
           <w:tcPr>
-            <w:tcW w:type="dxa" w:w="3005"/>
+            <w:tcW w:type="dxa" w:w="3441"/>
           </w:tcPr>
           <w:p>
             <w:pPr>
@@ -3907,7 +3907,7 @@
         </w:tc>
         <w:tc>
           <w:tcPr>
-            <w:tcW w:type="dxa" w:w="2381"/>
+            <w:tcW w:type="dxa" w:w="2727"/>
           </w:tcPr>
           <w:p>
             <w:pPr>
@@ -3924,7 +3924,7 @@
         </w:tc>
         <w:tc>
           <w:tcPr>
-            <w:tcW w:type="dxa" w:w="1587"/>
+            <w:tcW w:type="dxa" w:w="1818"/>
           </w:tcPr>
           <w:p>
             <w:pPr>
@@ -3946,7 +3946,7 @@
         </w:trPr>
         <w:tc>
           <w:tcPr>
-            <w:tcW w:type="dxa" w:w="567"/>
+            <w:tcW w:type="dxa" w:w="649"/>
             <w:shd w:val="clear" w:color="auto" w:fill="E8F5E9"/>
           </w:tcPr>
           <w:p>
@@ -3964,7 +3964,7 @@
         </w:tc>
         <w:tc>
           <w:tcPr>
-            <w:tcW w:type="dxa" w:w="2835"/>
+            <w:tcW w:type="dxa" w:w="3246"/>
           </w:tcPr>
           <w:p>
             <w:pPr>
@@ -3993,7 +3993,7 @@
         </w:tc>
         <w:tc>
           <w:tcPr>
-            <w:tcW w:type="dxa" w:w="3855"/>
+            <w:tcW w:type="dxa" w:w="4415"/>
           </w:tcPr>
           <w:p>
             <w:pPr>
@@ -4034,7 +4034,7 @@
         </w:tc>
         <w:tc>
           <w:tcPr>
-            <w:tcW w:type="dxa" w:w="850"/>
+            <w:tcW w:type="dxa" w:w="974"/>
           </w:tcPr>
           <w:p>
             <w:pPr>
@@ -4051,7 +4051,7 @@
         </w:tc>
         <w:tc>
           <w:tcPr>
-            <w:tcW w:type="dxa" w:w="3005"/>
+            <w:tcW w:type="dxa" w:w="3441"/>
           </w:tcPr>
           <w:p>
             <w:pPr>
@@ -4068,7 +4068,7 @@
         </w:tc>
         <w:tc>
           <w:tcPr>
-            <w:tcW w:type="dxa" w:w="2381"/>
+            <w:tcW w:type="dxa" w:w="2727"/>
           </w:tcPr>
           <w:p>
             <w:pPr>
@@ -4085,7 +4085,7 @@
         </w:tc>
         <w:tc>
           <w:tcPr>
-            <w:tcW w:type="dxa" w:w="1587"/>
+            <w:tcW w:type="dxa" w:w="1818"/>
           </w:tcPr>
           <w:p>
             <w:pPr>
@@ -4107,7 +4107,7 @@
         </w:trPr>
         <w:tc>
           <w:tcPr>
-            <w:tcW w:type="dxa" w:w="567"/>
+            <w:tcW w:type="dxa" w:w="649"/>
             <w:shd w:val="clear" w:color="auto" w:fill="E8F5E9"/>
           </w:tcPr>
           <w:p>
@@ -4125,7 +4125,7 @@
         </w:tc>
         <w:tc>
           <w:tcPr>
-            <w:tcW w:type="dxa" w:w="2835"/>
+            <w:tcW w:type="dxa" w:w="3246"/>
           </w:tcPr>
           <w:p>
             <w:pPr>
@@ -4142,7 +4142,7 @@
         </w:tc>
         <w:tc>
           <w:tcPr>
-            <w:tcW w:type="dxa" w:w="3855"/>
+            <w:tcW w:type="dxa" w:w="4415"/>
           </w:tcPr>
           <w:p>
             <w:pPr>
@@ -4183,7 +4183,7 @@
         </w:tc>
         <w:tc>
           <w:tcPr>
-            <w:tcW w:type="dxa" w:w="850"/>
+            <w:tcW w:type="dxa" w:w="974"/>
           </w:tcPr>
           <w:p>
             <w:pPr>
@@ -4200,7 +4200,7 @@
         </w:tc>
         <w:tc>
           <w:tcPr>
-            <w:tcW w:type="dxa" w:w="3005"/>
+            <w:tcW w:type="dxa" w:w="3441"/>
           </w:tcPr>
           <w:p>
             <w:pPr>
@@ -4217,7 +4217,7 @@
         </w:tc>
         <w:tc>
           <w:tcPr>
-            <w:tcW w:type="dxa" w:w="2381"/>
+            <w:tcW w:type="dxa" w:w="2727"/>
           </w:tcPr>
           <w:p>
             <w:pPr>
@@ -4234,7 +4234,7 @@
         </w:tc>
         <w:tc>
           <w:tcPr>
-            <w:tcW w:type="dxa" w:w="1587"/>
+            <w:tcW w:type="dxa" w:w="1818"/>
           </w:tcPr>
           <w:p>
             <w:pPr>
@@ -4256,7 +4256,7 @@
         </w:trPr>
         <w:tc>
           <w:tcPr>
-            <w:tcW w:type="dxa" w:w="567"/>
+            <w:tcW w:type="dxa" w:w="649"/>
             <w:shd w:val="clear" w:color="auto" w:fill="E8F5E9"/>
           </w:tcPr>
           <w:p>
@@ -4274,7 +4274,7 @@
         </w:tc>
         <w:tc>
           <w:tcPr>
-            <w:tcW w:type="dxa" w:w="2835"/>
+            <w:tcW w:type="dxa" w:w="3246"/>
           </w:tcPr>
           <w:p>
             <w:pPr>
@@ -4303,7 +4303,7 @@
         </w:tc>
         <w:tc>
           <w:tcPr>
-            <w:tcW w:type="dxa" w:w="3855"/>
+            <w:tcW w:type="dxa" w:w="4415"/>
           </w:tcPr>
           <w:p>
             <w:pPr>
@@ -4344,7 +4344,7 @@
         </w:tc>
         <w:tc>
           <w:tcPr>
-            <w:tcW w:type="dxa" w:w="850"/>
+            <w:tcW w:type="dxa" w:w="974"/>
           </w:tcPr>
           <w:p>
             <w:pPr>
@@ -4361,7 +4361,7 @@
         </w:tc>
         <w:tc>
           <w:tcPr>
-            <w:tcW w:type="dxa" w:w="3005"/>
+            <w:tcW w:type="dxa" w:w="3441"/>
           </w:tcPr>
           <w:p>
             <w:pPr>
@@ -4378,7 +4378,7 @@
         </w:tc>
         <w:tc>
           <w:tcPr>
-            <w:tcW w:type="dxa" w:w="2381"/>
+            <w:tcW w:type="dxa" w:w="2727"/>
           </w:tcPr>
           <w:p>
             <w:pPr>
@@ -4395,7 +4395,7 @@
         </w:tc>
         <w:tc>
           <w:tcPr>
-            <w:tcW w:type="dxa" w:w="1587"/>
+            <w:tcW w:type="dxa" w:w="1818"/>
           </w:tcPr>
           <w:p>
             <w:pPr>
@@ -4417,7 +4417,7 @@
         </w:trPr>
         <w:tc>
           <w:tcPr>
-            <w:tcW w:type="dxa" w:w="15080"/>
+            <w:tcW w:type="dxa" w:w="17270"/>
             <w:gridSpan w:val="7"/>
             <w:shd w:val="clear" w:color="auto" w:fill="2E7D32"/>
           </w:tcPr>
@@ -4442,7 +4442,7 @@
         </w:trPr>
         <w:tc>
           <w:tcPr>
-            <w:tcW w:type="dxa" w:w="567"/>
+            <w:tcW w:type="dxa" w:w="649"/>
             <w:shd w:val="clear" w:color="auto" w:fill="E8F5E9"/>
           </w:tcPr>
           <w:p>
@@ -4460,7 +4460,7 @@
         </w:tc>
         <w:tc>
           <w:tcPr>
-            <w:tcW w:type="dxa" w:w="2835"/>
+            <w:tcW w:type="dxa" w:w="3246"/>
           </w:tcPr>
           <w:p>
             <w:pPr>
@@ -4477,7 +4477,7 @@
         </w:tc>
         <w:tc>
           <w:tcPr>
-            <w:tcW w:type="dxa" w:w="3855"/>
+            <w:tcW w:type="dxa" w:w="4415"/>
           </w:tcPr>
           <w:p>
             <w:pPr>
@@ -4518,7 +4518,7 @@
         </w:tc>
         <w:tc>
           <w:tcPr>
-            <w:tcW w:type="dxa" w:w="850"/>
+            <w:tcW w:type="dxa" w:w="974"/>
           </w:tcPr>
           <w:p>
             <w:pPr>
@@ -4535,7 +4535,7 @@
         </w:tc>
         <w:tc>
           <w:tcPr>
-            <w:tcW w:type="dxa" w:w="3005"/>
+            <w:tcW w:type="dxa" w:w="3441"/>
           </w:tcPr>
           <w:p>
             <w:pPr>
@@ -4552,7 +4552,7 @@
         </w:tc>
         <w:tc>
           <w:tcPr>
-            <w:tcW w:type="dxa" w:w="2381"/>
+            <w:tcW w:type="dxa" w:w="2727"/>
           </w:tcPr>
           <w:p>
             <w:pPr>
@@ -4569,7 +4569,7 @@
         </w:tc>
         <w:tc>
           <w:tcPr>
-            <w:tcW w:type="dxa" w:w="1587"/>
+            <w:tcW w:type="dxa" w:w="1818"/>
           </w:tcPr>
           <w:p>
             <w:pPr>
@@ -4591,7 +4591,7 @@
         </w:trPr>
         <w:tc>
           <w:tcPr>
-            <w:tcW w:type="dxa" w:w="567"/>
+            <w:tcW w:type="dxa" w:w="649"/>
             <w:shd w:val="clear" w:color="auto" w:fill="E8F5E9"/>
           </w:tcPr>
           <w:p>
@@ -4609,7 +4609,7 @@
         </w:tc>
         <w:tc>
           <w:tcPr>
-            <w:tcW w:type="dxa" w:w="2835"/>
+            <w:tcW w:type="dxa" w:w="3246"/>
           </w:tcPr>
           <w:p>
             <w:pPr>
@@ -4638,7 +4638,7 @@
         </w:tc>
         <w:tc>
           <w:tcPr>
-            <w:tcW w:type="dxa" w:w="3855"/>
+            <w:tcW w:type="dxa" w:w="4415"/>
           </w:tcPr>
           <w:p>
             <w:pPr>
@@ -4679,7 +4679,7 @@
         </w:tc>
         <w:tc>
           <w:tcPr>
-            <w:tcW w:type="dxa" w:w="850"/>
+            <w:tcW w:type="dxa" w:w="974"/>
           </w:tcPr>
           <w:p>
             <w:pPr>
@@ -4696,7 +4696,7 @@
         </w:tc>
         <w:tc>
           <w:tcPr>
-            <w:tcW w:type="dxa" w:w="3005"/>
+            <w:tcW w:type="dxa" w:w="3441"/>
           </w:tcPr>
           <w:p>
             <w:pPr>
@@ -4713,7 +4713,7 @@
         </w:tc>
         <w:tc>
           <w:tcPr>
-            <w:tcW w:type="dxa" w:w="2381"/>
+            <w:tcW w:type="dxa" w:w="2727"/>
           </w:tcPr>
           <w:p>
             <w:pPr>
@@ -4730,7 +4730,7 @@
         </w:tc>
         <w:tc>
           <w:tcPr>
-            <w:tcW w:type="dxa" w:w="1587"/>
+            <w:tcW w:type="dxa" w:w="1818"/>
           </w:tcPr>
           <w:p>
             <w:pPr>
@@ -4752,7 +4752,7 @@
         </w:trPr>
         <w:tc>
           <w:tcPr>
-            <w:tcW w:type="dxa" w:w="567"/>
+            <w:tcW w:type="dxa" w:w="649"/>
             <w:shd w:val="clear" w:color="auto" w:fill="E8F5E9"/>
           </w:tcPr>
           <w:p>
@@ -4770,7 +4770,7 @@
         </w:tc>
         <w:tc>
           <w:tcPr>
-            <w:tcW w:type="dxa" w:w="2835"/>
+            <w:tcW w:type="dxa" w:w="3246"/>
           </w:tcPr>
           <w:p>
             <w:pPr>
@@ -4787,7 +4787,7 @@
         </w:tc>
         <w:tc>
           <w:tcPr>
-            <w:tcW w:type="dxa" w:w="3855"/>
+            <w:tcW w:type="dxa" w:w="4415"/>
           </w:tcPr>
           <w:p>
             <w:pPr>
@@ -4828,7 +4828,7 @@
         </w:tc>
         <w:tc>
           <w:tcPr>
-            <w:tcW w:type="dxa" w:w="850"/>
+            <w:tcW w:type="dxa" w:w="974"/>
           </w:tcPr>
           <w:p>
             <w:pPr>
@@ -4845,7 +4845,7 @@
         </w:tc>
         <w:tc>
           <w:tcPr>
-            <w:tcW w:type="dxa" w:w="3005"/>
+            <w:tcW w:type="dxa" w:w="3441"/>
           </w:tcPr>
           <w:p>
             <w:pPr>
@@ -4862,7 +4862,7 @@
         </w:tc>
         <w:tc>
           <w:tcPr>
-            <w:tcW w:type="dxa" w:w="2381"/>
+            <w:tcW w:type="dxa" w:w="2727"/>
           </w:tcPr>
           <w:p>
             <w:pPr>
@@ -4879,7 +4879,7 @@
         </w:tc>
         <w:tc>
           <w:tcPr>
-            <w:tcW w:type="dxa" w:w="1587"/>
+            <w:tcW w:type="dxa" w:w="1818"/>
           </w:tcPr>
           <w:p>
             <w:pPr>
@@ -4901,7 +4901,7 @@
         </w:trPr>
         <w:tc>
           <w:tcPr>
-            <w:tcW w:type="dxa" w:w="567"/>
+            <w:tcW w:type="dxa" w:w="649"/>
             <w:shd w:val="clear" w:color="auto" w:fill="E8F5E9"/>
           </w:tcPr>
           <w:p>
@@ -4919,7 +4919,7 @@
         </w:tc>
         <w:tc>
           <w:tcPr>
-            <w:tcW w:type="dxa" w:w="2835"/>
+            <w:tcW w:type="dxa" w:w="3246"/>
           </w:tcPr>
           <w:p>
             <w:pPr>
@@ -4948,7 +4948,7 @@
         </w:tc>
         <w:tc>
           <w:tcPr>
-            <w:tcW w:type="dxa" w:w="3855"/>
+            <w:tcW w:type="dxa" w:w="4415"/>
           </w:tcPr>
           <w:p>
             <w:pPr>
@@ -4989,7 +4989,7 @@
         </w:tc>
         <w:tc>
           <w:tcPr>
-            <w:tcW w:type="dxa" w:w="850"/>
+            <w:tcW w:type="dxa" w:w="974"/>
           </w:tcPr>
           <w:p>
             <w:pPr>
@@ -5006,7 +5006,7 @@
         </w:tc>
         <w:tc>
           <w:tcPr>
-            <w:tcW w:type="dxa" w:w="3005"/>
+            <w:tcW w:type="dxa" w:w="3441"/>
           </w:tcPr>
           <w:p>
             <w:pPr>
@@ -5023,7 +5023,7 @@
         </w:tc>
         <w:tc>
           <w:tcPr>
-            <w:tcW w:type="dxa" w:w="2381"/>
+            <w:tcW w:type="dxa" w:w="2727"/>
           </w:tcPr>
           <w:p>
             <w:pPr>
@@ -5040,7 +5040,7 @@
         </w:tc>
         <w:tc>
           <w:tcPr>
-            <w:tcW w:type="dxa" w:w="1587"/>
+            <w:tcW w:type="dxa" w:w="1818"/>
           </w:tcPr>
           <w:p>
             <w:pPr>
@@ -5062,7 +5062,7 @@
         </w:trPr>
         <w:tc>
           <w:tcPr>
-            <w:tcW w:type="dxa" w:w="567"/>
+            <w:tcW w:type="dxa" w:w="649"/>
             <w:shd w:val="clear" w:color="auto" w:fill="E8F5E9"/>
           </w:tcPr>
           <w:p>
@@ -5080,7 +5080,7 @@
         </w:tc>
         <w:tc>
           <w:tcPr>
-            <w:tcW w:type="dxa" w:w="2835"/>
+            <w:tcW w:type="dxa" w:w="3246"/>
           </w:tcPr>
           <w:p>
             <w:pPr>
@@ -5097,7 +5097,7 @@
         </w:tc>
         <w:tc>
           <w:tcPr>
-            <w:tcW w:type="dxa" w:w="3855"/>
+            <w:tcW w:type="dxa" w:w="4415"/>
           </w:tcPr>
           <w:p>
             <w:pPr>
@@ -5138,7 +5138,7 @@
         </w:tc>
         <w:tc>
           <w:tcPr>
-            <w:tcW w:type="dxa" w:w="850"/>
+            <w:tcW w:type="dxa" w:w="974"/>
           </w:tcPr>
           <w:p>
             <w:pPr>
@@ -5155,7 +5155,7 @@
         </w:tc>
         <w:tc>
           <w:tcPr>
-            <w:tcW w:type="dxa" w:w="3005"/>
+            <w:tcW w:type="dxa" w:w="3441"/>
           </w:tcPr>
           <w:p>
             <w:pPr>
@@ -5172,7 +5172,7 @@
         </w:tc>
         <w:tc>
           <w:tcPr>
-            <w:tcW w:type="dxa" w:w="2381"/>
+            <w:tcW w:type="dxa" w:w="2727"/>
           </w:tcPr>
           <w:p>
             <w:pPr>
@@ -5189,7 +5189,7 @@
         </w:tc>
         <w:tc>
           <w:tcPr>
-            <w:tcW w:type="dxa" w:w="1587"/>
+            <w:tcW w:type="dxa" w:w="1818"/>
           </w:tcPr>
           <w:p>
             <w:pPr>
@@ -5211,7 +5211,7 @@
         </w:trPr>
         <w:tc>
           <w:tcPr>
-            <w:tcW w:type="dxa" w:w="567"/>
+            <w:tcW w:type="dxa" w:w="649"/>
             <w:shd w:val="clear" w:color="auto" w:fill="E8F5E9"/>
           </w:tcPr>
           <w:p>
@@ -5229,7 +5229,7 @@
         </w:tc>
         <w:tc>
           <w:tcPr>
-            <w:tcW w:type="dxa" w:w="2835"/>
+            <w:tcW w:type="dxa" w:w="3246"/>
           </w:tcPr>
           <w:p>
             <w:pPr>
@@ -5258,7 +5258,7 @@
         </w:tc>
         <w:tc>
           <w:tcPr>
-            <w:tcW w:type="dxa" w:w="3855"/>
+            <w:tcW w:type="dxa" w:w="4415"/>
           </w:tcPr>
           <w:p>
             <w:pPr>
@@ -5299,7 +5299,7 @@
         </w:tc>
         <w:tc>
           <w:tcPr>
-            <w:tcW w:type="dxa" w:w="850"/>
+            <w:tcW w:type="dxa" w:w="974"/>
           </w:tcPr>
           <w:p>
             <w:pPr>
@@ -5316,7 +5316,7 @@
         </w:tc>
         <w:tc>
           <w:tcPr>
-            <w:tcW w:type="dxa" w:w="3005"/>
+            <w:tcW w:type="dxa" w:w="3441"/>
           </w:tcPr>
           <w:p>
             <w:pPr>
@@ -5333,7 +5333,7 @@
         </w:tc>
         <w:tc>
           <w:tcPr>
-            <w:tcW w:type="dxa" w:w="2381"/>
+            <w:tcW w:type="dxa" w:w="2727"/>
           </w:tcPr>
           <w:p>
             <w:pPr>
@@ -5350,7 +5350,7 @@
         </w:tc>
         <w:tc>
           <w:tcPr>
-            <w:tcW w:type="dxa" w:w="1587"/>
+            <w:tcW w:type="dxa" w:w="1818"/>
           </w:tcPr>
           <w:p>
             <w:pPr>
@@ -5372,7 +5372,7 @@
         </w:trPr>
         <w:tc>
           <w:tcPr>
-            <w:tcW w:type="dxa" w:w="15080"/>
+            <w:tcW w:type="dxa" w:w="17270"/>
             <w:gridSpan w:val="7"/>
             <w:shd w:val="clear" w:color="auto" w:fill="2E7D32"/>
           </w:tcPr>
@@ -5397,7 +5397,7 @@
         </w:trPr>
         <w:tc>
           <w:tcPr>
-            <w:tcW w:type="dxa" w:w="567"/>
+            <w:tcW w:type="dxa" w:w="649"/>
             <w:shd w:val="clear" w:color="auto" w:fill="E8F5E9"/>
           </w:tcPr>
           <w:p>
@@ -5415,7 +5415,7 @@
         </w:tc>
         <w:tc>
           <w:tcPr>
-            <w:tcW w:type="dxa" w:w="2835"/>
+            <w:tcW w:type="dxa" w:w="3246"/>
           </w:tcPr>
           <w:p>
             <w:pPr>
@@ -5432,7 +5432,7 @@
         </w:tc>
         <w:tc>
           <w:tcPr>
-            <w:tcW w:type="dxa" w:w="3855"/>
+            <w:tcW w:type="dxa" w:w="4415"/>
           </w:tcPr>
           <w:p>
             <w:pPr>
@@ -5473,7 +5473,7 @@
         </w:tc>
         <w:tc>
           <w:tcPr>
-            <w:tcW w:type="dxa" w:w="850"/>
+            <w:tcW w:type="dxa" w:w="974"/>
           </w:tcPr>
           <w:p>
             <w:pPr>
@@ -5490,7 +5490,7 @@
         </w:tc>
         <w:tc>
           <w:tcPr>
-            <w:tcW w:type="dxa" w:w="3005"/>
+            <w:tcW w:type="dxa" w:w="3441"/>
           </w:tcPr>
           <w:p>
             <w:pPr>
@@ -5507,7 +5507,7 @@
         </w:tc>
         <w:tc>
           <w:tcPr>
-            <w:tcW w:type="dxa" w:w="2381"/>
+            <w:tcW w:type="dxa" w:w="2727"/>
           </w:tcPr>
           <w:p>
             <w:pPr>
@@ -5524,7 +5524,7 @@
         </w:tc>
         <w:tc>
           <w:tcPr>
-            <w:tcW w:type="dxa" w:w="1587"/>
+            <w:tcW w:type="dxa" w:w="1818"/>
           </w:tcPr>
           <w:p>
             <w:pPr>
@@ -5546,7 +5546,7 @@
         </w:trPr>
         <w:tc>
           <w:tcPr>
-            <w:tcW w:type="dxa" w:w="567"/>
+            <w:tcW w:type="dxa" w:w="649"/>
             <w:shd w:val="clear" w:color="auto" w:fill="E8F5E9"/>
           </w:tcPr>
           <w:p>
@@ -5564,7 +5564,7 @@
         </w:tc>
         <w:tc>
           <w:tcPr>
-            <w:tcW w:type="dxa" w:w="2835"/>
+            <w:tcW w:type="dxa" w:w="3246"/>
           </w:tcPr>
           <w:p>
             <w:pPr>
@@ -5581,7 +5581,7 @@
         </w:tc>
         <w:tc>
           <w:tcPr>
-            <w:tcW w:type="dxa" w:w="3855"/>
+            <w:tcW w:type="dxa" w:w="4415"/>
           </w:tcPr>
           <w:p>
             <w:pPr>
@@ -5622,7 +5622,7 @@
         </w:tc>
         <w:tc>
           <w:tcPr>
-            <w:tcW w:type="dxa" w:w="850"/>
+            <w:tcW w:type="dxa" w:w="974"/>
           </w:tcPr>
           <w:p>
             <w:pPr>
@@ -5639,7 +5639,7 @@
         </w:tc>
         <w:tc>
           <w:tcPr>
-            <w:tcW w:type="dxa" w:w="3005"/>
+            <w:tcW w:type="dxa" w:w="3441"/>
           </w:tcPr>
           <w:p>
             <w:pPr>
@@ -5656,7 +5656,7 @@
         </w:tc>
         <w:tc>
           <w:tcPr>
-            <w:tcW w:type="dxa" w:w="2381"/>
+            <w:tcW w:type="dxa" w:w="2727"/>
           </w:tcPr>
           <w:p>
             <w:pPr>
@@ -5673,7 +5673,7 @@
         </w:tc>
         <w:tc>
           <w:tcPr>
-            <w:tcW w:type="dxa" w:w="1587"/>
+            <w:tcW w:type="dxa" w:w="1818"/>
           </w:tcPr>
           <w:p>
             <w:pPr>
@@ -5695,7 +5695,7 @@
         </w:trPr>
         <w:tc>
           <w:tcPr>
-            <w:tcW w:type="dxa" w:w="567"/>
+            <w:tcW w:type="dxa" w:w="649"/>
             <w:shd w:val="clear" w:color="auto" w:fill="E8F5E9"/>
           </w:tcPr>
           <w:p>
@@ -5713,7 +5713,7 @@
         </w:tc>
         <w:tc>
           <w:tcPr>
-            <w:tcW w:type="dxa" w:w="2835"/>
+            <w:tcW w:type="dxa" w:w="3246"/>
           </w:tcPr>
           <w:p>
             <w:pPr>
@@ -5730,7 +5730,7 @@
         </w:tc>
         <w:tc>
           <w:tcPr>
-            <w:tcW w:type="dxa" w:w="3855"/>
+            <w:tcW w:type="dxa" w:w="4415"/>
           </w:tcPr>
           <w:p>
             <w:pPr>
@@ -5771,7 +5771,7 @@
         </w:tc>
         <w:tc>
           <w:tcPr>
-            <w:tcW w:type="dxa" w:w="850"/>
+            <w:tcW w:type="dxa" w:w="974"/>
           </w:tcPr>
           <w:p>
             <w:pPr>
@@ -5788,7 +5788,7 @@
         </w:tc>
         <w:tc>
           <w:tcPr>
-            <w:tcW w:type="dxa" w:w="3005"/>
+            <w:tcW w:type="dxa" w:w="3441"/>
           </w:tcPr>
           <w:p>
             <w:pPr>
@@ -5805,7 +5805,7 @@
         </w:tc>
         <w:tc>
           <w:tcPr>
-            <w:tcW w:type="dxa" w:w="2381"/>
+            <w:tcW w:type="dxa" w:w="2727"/>
           </w:tcPr>
           <w:p>
             <w:pPr>
@@ -5822,7 +5822,7 @@
         </w:tc>
         <w:tc>
           <w:tcPr>
-            <w:tcW w:type="dxa" w:w="1587"/>
+            <w:tcW w:type="dxa" w:w="1818"/>
           </w:tcPr>
           <w:p>
             <w:pPr>
@@ -5844,7 +5844,7 @@
         </w:trPr>
         <w:tc>
           <w:tcPr>
-            <w:tcW w:type="dxa" w:w="567"/>
+            <w:tcW w:type="dxa" w:w="649"/>
             <w:shd w:val="clear" w:color="auto" w:fill="EAF0F6"/>
           </w:tcPr>
           <w:p>
@@ -5862,7 +5862,7 @@
         </w:tc>
         <w:tc>
           <w:tcPr>
-            <w:tcW w:type="dxa" w:w="2835"/>
+            <w:tcW w:type="dxa" w:w="3246"/>
             <w:shd w:val="clear" w:color="auto" w:fill="EAF0F6"/>
           </w:tcPr>
           <w:p>
@@ -5880,7 +5880,7 @@
         </w:tc>
         <w:tc>
           <w:tcPr>
-            <w:tcW w:type="dxa" w:w="3855"/>
+            <w:tcW w:type="dxa" w:w="4415"/>
             <w:shd w:val="clear" w:color="auto" w:fill="EAF0F6"/>
           </w:tcPr>
           <w:p>
@@ -5922,7 +5922,7 @@
         </w:tc>
         <w:tc>
           <w:tcPr>
-            <w:tcW w:type="dxa" w:w="850"/>
+            <w:tcW w:type="dxa" w:w="974"/>
             <w:shd w:val="clear" w:color="auto" w:fill="EAF0F6"/>
           </w:tcPr>
           <w:p>
@@ -5940,7 +5940,7 @@
         </w:tc>
         <w:tc>
           <w:tcPr>
-            <w:tcW w:type="dxa" w:w="3005"/>
+            <w:tcW w:type="dxa" w:w="3441"/>
             <w:shd w:val="clear" w:color="auto" w:fill="EAF0F6"/>
           </w:tcPr>
           <w:p>
@@ -5958,7 +5958,7 @@
         </w:tc>
         <w:tc>
           <w:tcPr>
-            <w:tcW w:type="dxa" w:w="2381"/>
+            <w:tcW w:type="dxa" w:w="2727"/>
             <w:shd w:val="clear" w:color="auto" w:fill="EAF0F6"/>
           </w:tcPr>
           <w:p>
@@ -5976,7 +5976,7 @@
         </w:tc>
         <w:tc>
           <w:tcPr>
-            <w:tcW w:type="dxa" w:w="1587"/>
+            <w:tcW w:type="dxa" w:w="1818"/>
             <w:shd w:val="clear" w:color="auto" w:fill="EAF0F6"/>
           </w:tcPr>
           <w:p>
@@ -6195,8 +6195,8 @@
     <w:sectPr>
       <w:footerReference w:type="default" r:id="rId40"/>
       <w:headerReference w:type="default" r:id="rId41"/>
-      <w:pgSz w:w="16838" w:h="11906" w:orient="landscape"/>
-      <w:pgMar w:top="680" w:right="850" w:bottom="680" w:left="850" w:header="720" w:footer="720" w:gutter="0"/>
+      <w:pgSz w:w="18709" w:h="12246" w:orient="landscape"/>
+      <w:pgMar w:top="720" w:right="720" w:bottom="720" w:left="720" w:header="340" w:footer="340" w:gutter="0"/>
       <w:cols w:space="720"/>
       <w:docGrid w:linePitch="360"/>
     </w:sectPr>

</xml_diff>